<commit_message>
Safe tijdens plots maken
</commit_message>
<xml_diff>
--- a/Verslag Julia Set.docx
+++ b/Verslag Julia Set.docx
@@ -374,6 +374,28 @@
         </w:rPr>
         <w:t>geeft aan dat de parallellisatie over beide assen loops gaat.</w:t>
       </w:r>
+      <w:r>
+        <w:rPr>
+          <w:sz w:val="20"/>
+          <w:szCs w:val="20"/>
+        </w:rPr>
+        <w:t xml:space="preserve"> </w:t>
+      </w:r>
+      <w:r>
+        <w:rPr>
+          <w:rFonts w:ascii="Consolas" w:hAnsi="Consolas"/>
+          <w:sz w:val="20"/>
+          <w:szCs w:val="20"/>
+        </w:rPr>
+        <w:t>Schedule (dynamic)</w:t>
+      </w:r>
+      <w:r>
+        <w:rPr>
+          <w:sz w:val="20"/>
+          <w:szCs w:val="20"/>
+        </w:rPr>
+        <w:t xml:space="preserve"> zorgt ervoor dat het werk dynamisch wordt verdeeld wat inhoudt dat als een deel klaar is het automatisch helpt met de resterende workload. </w:t>
+      </w:r>
     </w:p>
     <w:p>
       <w:pPr>
@@ -507,13 +529,13 @@
           <w:noProof/>
         </w:rPr>
         <w:drawing>
-          <wp:anchor distT="0" distB="0" distL="114300" distR="114300" simplePos="0" relativeHeight="251658240" behindDoc="0" locked="0" layoutInCell="1" allowOverlap="1" wp14:anchorId="5F41AF9B" wp14:editId="10493EC8">
+          <wp:anchor distT="0" distB="0" distL="114300" distR="114300" simplePos="0" relativeHeight="251658240" behindDoc="0" locked="0" layoutInCell="1" allowOverlap="1" wp14:anchorId="5F41AF9B" wp14:editId="55D3A88D">
             <wp:simplePos x="0" y="0"/>
             <wp:positionH relativeFrom="margin">
-              <wp:align>right</wp:align>
+              <wp:posOffset>2824001</wp:posOffset>
             </wp:positionH>
             <wp:positionV relativeFrom="page">
-              <wp:posOffset>5657263</wp:posOffset>
+              <wp:posOffset>6105789</wp:posOffset>
             </wp:positionV>
             <wp:extent cx="2883535" cy="2656840"/>
             <wp:effectExtent l="0" t="0" r="0" b="0"/>
@@ -1011,6 +1033,7 @@
           <w:szCs w:val="20"/>
           <w:lang w:val="en-NL"/>
         </w:rPr>
+        <w:lastRenderedPageBreak/>
         <w:t>Bereik van een chunk</w:t>
       </w:r>
     </w:p>
@@ -1418,7 +1441,6 @@
           <w:szCs w:val="20"/>
           <w:lang w:val="en-NL"/>
         </w:rPr>
-        <w:lastRenderedPageBreak/>
         <w:t>Frames per chunk laden</w:t>
       </w:r>
     </w:p>
@@ -4202,15 +4224,8 @@
           <w:sz w:val="20"/>
           <w:szCs w:val="20"/>
         </w:rPr>
-        <w:t xml:space="preserve">Dit komt vooral omdat de loop afhankelijk is van zijn vorige resultaat, het is niet mogelijk de volgende loop te starten zonder het resultaat van de vorige. Daarbuiten is een onbekend bereik van de while </w:t>
-      </w:r>
-      <w:r>
-        <w:rPr>
-          <w:sz w:val="20"/>
-          <w:szCs w:val="20"/>
-        </w:rPr>
         <w:lastRenderedPageBreak/>
-        <w:t xml:space="preserve">loop ook niet geschikt doordat OpenMP het werk niet eerlijk kan verdelen als het niet weet </w:t>
+        <w:t xml:space="preserve">Dit komt vooral omdat de loop afhankelijk is van zijn vorige resultaat, het is niet mogelijk de volgende loop te starten zonder het resultaat van de vorige. Daarbuiten is een onbekend bereik van de while loop ook niet geschikt doordat OpenMP het werk niet eerlijk kan verdelen als het niet weet </w:t>
       </w:r>
       <w:r>
         <w:rPr>
@@ -4266,39 +4281,1914 @@
           <w:sz w:val="20"/>
           <w:szCs w:val="20"/>
         </w:rPr>
-        <w:t xml:space="preserve">In de bovenstaande bladzijde zijn mijn gemaakte keuzes al onderbouwd. Ik ga wel nog timing data en scheduling toevoegen voor verschillende aantal cores en neem je mee door dit proces. </w:t>
-      </w:r>
-    </w:p>
-    <w:p>
-      <w:pPr>
-        <w:rPr>
-          <w:sz w:val="20"/>
-          <w:szCs w:val="20"/>
-        </w:rPr>
-      </w:pPr>
-      <w:r>
-        <w:rPr>
-          <w:sz w:val="20"/>
-          <w:szCs w:val="20"/>
-        </w:rPr>
-        <w:t>Allereerst een baseline meting door OpenMP weg te halen en het aantal cores op 1 te zetten.</w:t>
-      </w:r>
-    </w:p>
-    <w:p>
-      <w:pPr>
-        <w:rPr>
-          <w:sz w:val="20"/>
-          <w:szCs w:val="20"/>
-        </w:rPr>
-      </w:pPr>
-    </w:p>
-    <w:p>
-      <w:pPr>
-        <w:rPr>
-          <w:sz w:val="20"/>
-          <w:szCs w:val="20"/>
-        </w:rPr>
-      </w:pPr>
+        <w:t xml:space="preserve">In de bovenstaande bladzijde zijn mijn gemaakte keuzes al onderbouwd. Ik ga wel nog timing data toevoegen voor verschillende aantal cores en neem je mee door dit proces. </w:t>
+      </w:r>
+    </w:p>
+    <w:p>
+      <w:pPr>
+        <w:rPr>
+          <w:sz w:val="20"/>
+          <w:szCs w:val="20"/>
+        </w:rPr>
+      </w:pPr>
+      <w:r>
+        <w:rPr>
+          <w:sz w:val="20"/>
+          <w:szCs w:val="20"/>
+        </w:rPr>
+        <w:t>Voor de metingen zijn alle beschikbare cores (1 t/m 6) met en zonder OpenMP te getest.</w:t>
+      </w:r>
+    </w:p>
+    <w:p>
+      <w:pPr>
+        <w:rPr>
+          <w:i/>
+          <w:iCs/>
+          <w:sz w:val="20"/>
+          <w:szCs w:val="20"/>
+        </w:rPr>
+      </w:pPr>
+      <w:r>
+        <w:rPr>
+          <w:i/>
+          <w:iCs/>
+          <w:sz w:val="20"/>
+          <w:szCs w:val="20"/>
+        </w:rPr>
+        <w:t>Data:</w:t>
+      </w:r>
+    </w:p>
+    <w:tbl>
+      <w:tblPr>
+        <w:tblW w:w="4725" w:type="dxa"/>
+        <w:tblLook w:val="04A0" w:firstRow="1" w:lastRow="0" w:firstColumn="1" w:lastColumn="0" w:noHBand="0" w:noVBand="1"/>
+      </w:tblPr>
+      <w:tblGrid>
+        <w:gridCol w:w="1220"/>
+        <w:gridCol w:w="1005"/>
+        <w:gridCol w:w="1320"/>
+        <w:gridCol w:w="1180"/>
+      </w:tblGrid>
+      <w:tr>
+        <w:trPr>
+          <w:trHeight w:val="300"/>
+        </w:trPr>
+        <w:tc>
+          <w:tcPr>
+            <w:tcW w:w="1220" w:type="dxa"/>
+            <w:tcBorders>
+              <w:top w:val="nil"/>
+              <w:left w:val="nil"/>
+              <w:bottom w:val="nil"/>
+              <w:right w:val="nil"/>
+            </w:tcBorders>
+            <w:noWrap/>
+            <w:vAlign w:val="bottom"/>
+            <w:hideMark/>
+          </w:tcPr>
+          <w:p>
+            <w:pPr>
+              <w:spacing w:line="240" w:lineRule="auto"/>
+              <w:rPr>
+                <w:rFonts w:ascii="Calibri" w:eastAsia="Times New Roman" w:hAnsi="Calibri" w:cs="Calibri"/>
+                <w:color w:val="000000"/>
+                <w:lang w:val="en-NL"/>
+              </w:rPr>
+            </w:pPr>
+            <w:r>
+              <w:rPr>
+                <w:rFonts w:ascii="Calibri" w:eastAsia="Times New Roman" w:hAnsi="Calibri" w:cs="Calibri"/>
+                <w:color w:val="000000"/>
+                <w:lang w:val="en-NL"/>
+              </w:rPr>
+              <w:t>aantal cores</w:t>
+            </w:r>
+          </w:p>
+        </w:tc>
+        <w:tc>
+          <w:tcPr>
+            <w:tcW w:w="1005" w:type="dxa"/>
+            <w:tcBorders>
+              <w:top w:val="nil"/>
+              <w:left w:val="nil"/>
+              <w:bottom w:val="nil"/>
+              <w:right w:val="nil"/>
+            </w:tcBorders>
+            <w:noWrap/>
+            <w:vAlign w:val="bottom"/>
+            <w:hideMark/>
+          </w:tcPr>
+          <w:p>
+            <w:pPr>
+              <w:spacing w:line="240" w:lineRule="auto"/>
+              <w:rPr>
+                <w:rFonts w:ascii="Calibri" w:eastAsia="Times New Roman" w:hAnsi="Calibri" w:cs="Calibri"/>
+                <w:color w:val="000000"/>
+                <w:lang w:val="en-NL"/>
+              </w:rPr>
+            </w:pPr>
+            <w:r>
+              <w:rPr>
+                <w:rFonts w:ascii="Calibri" w:eastAsia="Times New Roman" w:hAnsi="Calibri" w:cs="Calibri"/>
+                <w:color w:val="000000"/>
+                <w:lang w:val="en-NL"/>
+              </w:rPr>
+              <w:t>OpenMP</w:t>
+            </w:r>
+          </w:p>
+        </w:tc>
+        <w:tc>
+          <w:tcPr>
+            <w:tcW w:w="1320" w:type="dxa"/>
+            <w:tcBorders>
+              <w:top w:val="nil"/>
+              <w:left w:val="nil"/>
+              <w:bottom w:val="nil"/>
+              <w:right w:val="nil"/>
+            </w:tcBorders>
+            <w:noWrap/>
+            <w:vAlign w:val="bottom"/>
+            <w:hideMark/>
+          </w:tcPr>
+          <w:p>
+            <w:pPr>
+              <w:spacing w:line="240" w:lineRule="auto"/>
+              <w:rPr>
+                <w:rFonts w:ascii="Calibri" w:eastAsia="Times New Roman" w:hAnsi="Calibri" w:cs="Calibri"/>
+                <w:color w:val="000000"/>
+                <w:lang w:val="en-NL"/>
+              </w:rPr>
+            </w:pPr>
+            <w:r>
+              <w:rPr>
+                <w:rFonts w:ascii="Calibri" w:eastAsia="Times New Roman" w:hAnsi="Calibri" w:cs="Calibri"/>
+                <w:color w:val="000000"/>
+                <w:lang w:val="en-NL"/>
+              </w:rPr>
+              <w:t>tijd totaal</w:t>
+            </w:r>
+          </w:p>
+        </w:tc>
+        <w:tc>
+          <w:tcPr>
+            <w:tcW w:w="1180" w:type="dxa"/>
+            <w:tcBorders>
+              <w:top w:val="nil"/>
+              <w:left w:val="nil"/>
+              <w:bottom w:val="nil"/>
+              <w:right w:val="nil"/>
+            </w:tcBorders>
+            <w:noWrap/>
+            <w:vAlign w:val="bottom"/>
+            <w:hideMark/>
+          </w:tcPr>
+          <w:p>
+            <w:pPr>
+              <w:spacing w:line="240" w:lineRule="auto"/>
+              <w:rPr>
+                <w:rFonts w:ascii="Calibri" w:eastAsia="Times New Roman" w:hAnsi="Calibri" w:cs="Calibri"/>
+                <w:color w:val="000000"/>
+                <w:lang w:val="en-NL"/>
+              </w:rPr>
+            </w:pPr>
+            <w:r>
+              <w:rPr>
+                <w:rFonts w:ascii="Calibri" w:eastAsia="Times New Roman" w:hAnsi="Calibri" w:cs="Calibri"/>
+                <w:color w:val="000000"/>
+                <w:lang w:val="en-NL"/>
+              </w:rPr>
+              <w:t>redering time</w:t>
+            </w:r>
+          </w:p>
+        </w:tc>
+      </w:tr>
+      <w:tr>
+        <w:trPr>
+          <w:trHeight w:val="300"/>
+        </w:trPr>
+        <w:tc>
+          <w:tcPr>
+            <w:tcW w:w="1220" w:type="dxa"/>
+            <w:tcBorders>
+              <w:top w:val="nil"/>
+              <w:left w:val="nil"/>
+              <w:bottom w:val="nil"/>
+              <w:right w:val="nil"/>
+            </w:tcBorders>
+            <w:noWrap/>
+            <w:vAlign w:val="bottom"/>
+            <w:hideMark/>
+          </w:tcPr>
+          <w:p>
+            <w:pPr>
+              <w:spacing w:line="240" w:lineRule="auto"/>
+              <w:jc w:val="right"/>
+              <w:rPr>
+                <w:rFonts w:ascii="Calibri" w:eastAsia="Times New Roman" w:hAnsi="Calibri" w:cs="Calibri"/>
+                <w:color w:val="000000"/>
+                <w:lang w:val="en-NL"/>
+              </w:rPr>
+            </w:pPr>
+            <w:r>
+              <w:rPr>
+                <w:rFonts w:ascii="Calibri" w:eastAsia="Times New Roman" w:hAnsi="Calibri" w:cs="Calibri"/>
+                <w:color w:val="000000"/>
+                <w:lang w:val="en-NL"/>
+              </w:rPr>
+              <w:t>1</w:t>
+            </w:r>
+          </w:p>
+        </w:tc>
+        <w:tc>
+          <w:tcPr>
+            <w:tcW w:w="1005" w:type="dxa"/>
+            <w:tcBorders>
+              <w:top w:val="nil"/>
+              <w:left w:val="nil"/>
+              <w:bottom w:val="nil"/>
+              <w:right w:val="nil"/>
+            </w:tcBorders>
+            <w:noWrap/>
+            <w:vAlign w:val="bottom"/>
+            <w:hideMark/>
+          </w:tcPr>
+          <w:p>
+            <w:pPr>
+              <w:spacing w:line="240" w:lineRule="auto"/>
+              <w:jc w:val="center"/>
+              <w:rPr>
+                <w:rFonts w:ascii="Calibri" w:eastAsia="Times New Roman" w:hAnsi="Calibri" w:cs="Calibri"/>
+                <w:color w:val="000000"/>
+                <w:lang w:val="en-NL"/>
+              </w:rPr>
+            </w:pPr>
+            <w:r>
+              <w:rPr>
+                <w:rFonts w:ascii="Calibri" w:eastAsia="Times New Roman" w:hAnsi="Calibri" w:cs="Calibri"/>
+                <w:color w:val="000000"/>
+                <w:lang w:val="en-NL"/>
+              </w:rPr>
+              <w:t>FALSE</w:t>
+            </w:r>
+          </w:p>
+        </w:tc>
+        <w:tc>
+          <w:tcPr>
+            <w:tcW w:w="1320" w:type="dxa"/>
+            <w:tcBorders>
+              <w:top w:val="nil"/>
+              <w:left w:val="nil"/>
+              <w:bottom w:val="nil"/>
+              <w:right w:val="nil"/>
+            </w:tcBorders>
+            <w:noWrap/>
+            <w:vAlign w:val="bottom"/>
+            <w:hideMark/>
+          </w:tcPr>
+          <w:p>
+            <w:pPr>
+              <w:spacing w:line="240" w:lineRule="auto"/>
+              <w:jc w:val="right"/>
+              <w:rPr>
+                <w:rFonts w:ascii="Calibri" w:eastAsia="Times New Roman" w:hAnsi="Calibri" w:cs="Calibri"/>
+                <w:color w:val="000000"/>
+                <w:lang w:val="en-NL"/>
+              </w:rPr>
+            </w:pPr>
+            <w:r>
+              <w:rPr>
+                <w:rFonts w:ascii="Calibri" w:eastAsia="Times New Roman" w:hAnsi="Calibri" w:cs="Calibri"/>
+                <w:color w:val="000000"/>
+                <w:lang w:val="en-NL"/>
+              </w:rPr>
+              <w:t>13,7813</w:t>
+            </w:r>
+          </w:p>
+        </w:tc>
+        <w:tc>
+          <w:tcPr>
+            <w:tcW w:w="1180" w:type="dxa"/>
+            <w:tcBorders>
+              <w:top w:val="nil"/>
+              <w:left w:val="nil"/>
+              <w:bottom w:val="nil"/>
+              <w:right w:val="nil"/>
+            </w:tcBorders>
+            <w:noWrap/>
+            <w:vAlign w:val="bottom"/>
+            <w:hideMark/>
+          </w:tcPr>
+          <w:p>
+            <w:pPr>
+              <w:spacing w:line="240" w:lineRule="auto"/>
+              <w:jc w:val="right"/>
+              <w:rPr>
+                <w:rFonts w:ascii="Calibri" w:eastAsia="Times New Roman" w:hAnsi="Calibri" w:cs="Calibri"/>
+                <w:color w:val="000000"/>
+                <w:lang w:val="en-NL"/>
+              </w:rPr>
+            </w:pPr>
+            <w:r>
+              <w:rPr>
+                <w:rFonts w:ascii="Calibri" w:eastAsia="Times New Roman" w:hAnsi="Calibri" w:cs="Calibri"/>
+                <w:color w:val="000000"/>
+                <w:lang w:val="en-NL"/>
+              </w:rPr>
+              <w:t>11,0984</w:t>
+            </w:r>
+          </w:p>
+        </w:tc>
+      </w:tr>
+      <w:tr>
+        <w:trPr>
+          <w:trHeight w:val="300"/>
+        </w:trPr>
+        <w:tc>
+          <w:tcPr>
+            <w:tcW w:w="1220" w:type="dxa"/>
+            <w:tcBorders>
+              <w:top w:val="nil"/>
+              <w:left w:val="nil"/>
+              <w:bottom w:val="nil"/>
+              <w:right w:val="nil"/>
+            </w:tcBorders>
+            <w:noWrap/>
+            <w:vAlign w:val="bottom"/>
+            <w:hideMark/>
+          </w:tcPr>
+          <w:p>
+            <w:pPr>
+              <w:spacing w:line="240" w:lineRule="auto"/>
+              <w:jc w:val="right"/>
+              <w:rPr>
+                <w:rFonts w:ascii="Calibri" w:eastAsia="Times New Roman" w:hAnsi="Calibri" w:cs="Calibri"/>
+                <w:color w:val="000000"/>
+                <w:lang w:val="en-NL"/>
+              </w:rPr>
+            </w:pPr>
+            <w:r>
+              <w:rPr>
+                <w:rFonts w:ascii="Calibri" w:eastAsia="Times New Roman" w:hAnsi="Calibri" w:cs="Calibri"/>
+                <w:color w:val="000000"/>
+                <w:lang w:val="en-NL"/>
+              </w:rPr>
+              <w:t>1</w:t>
+            </w:r>
+          </w:p>
+        </w:tc>
+        <w:tc>
+          <w:tcPr>
+            <w:tcW w:w="1005" w:type="dxa"/>
+            <w:tcBorders>
+              <w:top w:val="nil"/>
+              <w:left w:val="nil"/>
+              <w:bottom w:val="nil"/>
+              <w:right w:val="nil"/>
+            </w:tcBorders>
+            <w:noWrap/>
+            <w:vAlign w:val="bottom"/>
+            <w:hideMark/>
+          </w:tcPr>
+          <w:p>
+            <w:pPr>
+              <w:spacing w:line="240" w:lineRule="auto"/>
+              <w:jc w:val="center"/>
+              <w:rPr>
+                <w:rFonts w:ascii="Calibri" w:eastAsia="Times New Roman" w:hAnsi="Calibri" w:cs="Calibri"/>
+                <w:color w:val="000000"/>
+                <w:lang w:val="en-NL"/>
+              </w:rPr>
+            </w:pPr>
+            <w:r>
+              <w:rPr>
+                <w:rFonts w:ascii="Calibri" w:eastAsia="Times New Roman" w:hAnsi="Calibri" w:cs="Calibri"/>
+                <w:color w:val="000000"/>
+                <w:lang w:val="en-NL"/>
+              </w:rPr>
+              <w:t>TRUE</w:t>
+            </w:r>
+          </w:p>
+        </w:tc>
+        <w:tc>
+          <w:tcPr>
+            <w:tcW w:w="1320" w:type="dxa"/>
+            <w:tcBorders>
+              <w:top w:val="nil"/>
+              <w:left w:val="nil"/>
+              <w:bottom w:val="nil"/>
+              <w:right w:val="nil"/>
+            </w:tcBorders>
+            <w:noWrap/>
+            <w:vAlign w:val="bottom"/>
+            <w:hideMark/>
+          </w:tcPr>
+          <w:p>
+            <w:pPr>
+              <w:spacing w:line="240" w:lineRule="auto"/>
+              <w:jc w:val="right"/>
+              <w:rPr>
+                <w:rFonts w:ascii="Calibri" w:eastAsia="Times New Roman" w:hAnsi="Calibri" w:cs="Calibri"/>
+                <w:color w:val="000000"/>
+                <w:lang w:val="en-NL"/>
+              </w:rPr>
+            </w:pPr>
+            <w:r>
+              <w:rPr>
+                <w:rFonts w:ascii="Calibri" w:eastAsia="Times New Roman" w:hAnsi="Calibri" w:cs="Calibri"/>
+                <w:color w:val="000000"/>
+                <w:lang w:val="en-NL"/>
+              </w:rPr>
+              <w:t>13,4933</w:t>
+            </w:r>
+          </w:p>
+        </w:tc>
+        <w:tc>
+          <w:tcPr>
+            <w:tcW w:w="1180" w:type="dxa"/>
+            <w:tcBorders>
+              <w:top w:val="nil"/>
+              <w:left w:val="nil"/>
+              <w:bottom w:val="nil"/>
+              <w:right w:val="nil"/>
+            </w:tcBorders>
+            <w:noWrap/>
+            <w:vAlign w:val="bottom"/>
+            <w:hideMark/>
+          </w:tcPr>
+          <w:p>
+            <w:pPr>
+              <w:spacing w:line="240" w:lineRule="auto"/>
+              <w:jc w:val="right"/>
+              <w:rPr>
+                <w:rFonts w:ascii="Calibri" w:eastAsia="Times New Roman" w:hAnsi="Calibri" w:cs="Calibri"/>
+                <w:color w:val="000000"/>
+                <w:lang w:val="en-NL"/>
+              </w:rPr>
+            </w:pPr>
+            <w:r>
+              <w:rPr>
+                <w:rFonts w:ascii="Calibri" w:eastAsia="Times New Roman" w:hAnsi="Calibri" w:cs="Calibri"/>
+                <w:color w:val="000000"/>
+                <w:lang w:val="en-NL"/>
+              </w:rPr>
+              <w:t>10,8154</w:t>
+            </w:r>
+          </w:p>
+        </w:tc>
+      </w:tr>
+      <w:tr>
+        <w:trPr>
+          <w:trHeight w:val="300"/>
+        </w:trPr>
+        <w:tc>
+          <w:tcPr>
+            <w:tcW w:w="1220" w:type="dxa"/>
+            <w:tcBorders>
+              <w:top w:val="nil"/>
+              <w:left w:val="nil"/>
+              <w:bottom w:val="nil"/>
+              <w:right w:val="nil"/>
+            </w:tcBorders>
+            <w:noWrap/>
+            <w:vAlign w:val="bottom"/>
+            <w:hideMark/>
+          </w:tcPr>
+          <w:p>
+            <w:pPr>
+              <w:spacing w:line="240" w:lineRule="auto"/>
+              <w:jc w:val="right"/>
+              <w:rPr>
+                <w:rFonts w:ascii="Calibri" w:eastAsia="Times New Roman" w:hAnsi="Calibri" w:cs="Calibri"/>
+                <w:color w:val="000000"/>
+                <w:lang w:val="en-NL"/>
+              </w:rPr>
+            </w:pPr>
+            <w:r>
+              <w:rPr>
+                <w:rFonts w:ascii="Calibri" w:eastAsia="Times New Roman" w:hAnsi="Calibri" w:cs="Calibri"/>
+                <w:color w:val="000000"/>
+                <w:lang w:val="en-NL"/>
+              </w:rPr>
+              <w:t>2</w:t>
+            </w:r>
+          </w:p>
+        </w:tc>
+        <w:tc>
+          <w:tcPr>
+            <w:tcW w:w="1005" w:type="dxa"/>
+            <w:tcBorders>
+              <w:top w:val="nil"/>
+              <w:left w:val="nil"/>
+              <w:bottom w:val="nil"/>
+              <w:right w:val="nil"/>
+            </w:tcBorders>
+            <w:noWrap/>
+            <w:vAlign w:val="bottom"/>
+            <w:hideMark/>
+          </w:tcPr>
+          <w:p>
+            <w:pPr>
+              <w:spacing w:line="240" w:lineRule="auto"/>
+              <w:jc w:val="center"/>
+              <w:rPr>
+                <w:rFonts w:ascii="Calibri" w:eastAsia="Times New Roman" w:hAnsi="Calibri" w:cs="Calibri"/>
+                <w:color w:val="000000"/>
+                <w:lang w:val="en-NL"/>
+              </w:rPr>
+            </w:pPr>
+            <w:r>
+              <w:rPr>
+                <w:rFonts w:ascii="Calibri" w:eastAsia="Times New Roman" w:hAnsi="Calibri" w:cs="Calibri"/>
+                <w:color w:val="000000"/>
+                <w:lang w:val="en-NL"/>
+              </w:rPr>
+              <w:t>FALSE</w:t>
+            </w:r>
+          </w:p>
+        </w:tc>
+        <w:tc>
+          <w:tcPr>
+            <w:tcW w:w="1320" w:type="dxa"/>
+            <w:tcBorders>
+              <w:top w:val="nil"/>
+              <w:left w:val="nil"/>
+              <w:bottom w:val="nil"/>
+              <w:right w:val="nil"/>
+            </w:tcBorders>
+            <w:noWrap/>
+            <w:vAlign w:val="bottom"/>
+            <w:hideMark/>
+          </w:tcPr>
+          <w:p>
+            <w:pPr>
+              <w:spacing w:line="240" w:lineRule="auto"/>
+              <w:jc w:val="right"/>
+              <w:rPr>
+                <w:rFonts w:ascii="Calibri" w:eastAsia="Times New Roman" w:hAnsi="Calibri" w:cs="Calibri"/>
+                <w:color w:val="000000"/>
+                <w:lang w:val="en-NL"/>
+              </w:rPr>
+            </w:pPr>
+            <w:r>
+              <w:rPr>
+                <w:rFonts w:ascii="Calibri" w:eastAsia="Times New Roman" w:hAnsi="Calibri" w:cs="Calibri"/>
+                <w:color w:val="000000"/>
+                <w:lang w:val="en-NL"/>
+              </w:rPr>
+              <w:t>9,8646</w:t>
+            </w:r>
+          </w:p>
+        </w:tc>
+        <w:tc>
+          <w:tcPr>
+            <w:tcW w:w="1180" w:type="dxa"/>
+            <w:tcBorders>
+              <w:top w:val="nil"/>
+              <w:left w:val="nil"/>
+              <w:bottom w:val="nil"/>
+              <w:right w:val="nil"/>
+            </w:tcBorders>
+            <w:noWrap/>
+            <w:vAlign w:val="bottom"/>
+            <w:hideMark/>
+          </w:tcPr>
+          <w:p>
+            <w:pPr>
+              <w:spacing w:line="240" w:lineRule="auto"/>
+              <w:jc w:val="right"/>
+              <w:rPr>
+                <w:rFonts w:ascii="Calibri" w:eastAsia="Times New Roman" w:hAnsi="Calibri" w:cs="Calibri"/>
+                <w:color w:val="000000"/>
+                <w:lang w:val="en-NL"/>
+              </w:rPr>
+            </w:pPr>
+            <w:r>
+              <w:rPr>
+                <w:rFonts w:ascii="Calibri" w:eastAsia="Times New Roman" w:hAnsi="Calibri" w:cs="Calibri"/>
+                <w:color w:val="000000"/>
+                <w:lang w:val="en-NL"/>
+              </w:rPr>
+              <w:t>3,6321</w:t>
+            </w:r>
+          </w:p>
+        </w:tc>
+      </w:tr>
+      <w:tr>
+        <w:trPr>
+          <w:trHeight w:val="300"/>
+        </w:trPr>
+        <w:tc>
+          <w:tcPr>
+            <w:tcW w:w="1220" w:type="dxa"/>
+            <w:tcBorders>
+              <w:top w:val="nil"/>
+              <w:left w:val="nil"/>
+              <w:bottom w:val="nil"/>
+              <w:right w:val="nil"/>
+            </w:tcBorders>
+            <w:noWrap/>
+            <w:vAlign w:val="bottom"/>
+            <w:hideMark/>
+          </w:tcPr>
+          <w:p>
+            <w:pPr>
+              <w:spacing w:line="240" w:lineRule="auto"/>
+              <w:jc w:val="right"/>
+              <w:rPr>
+                <w:rFonts w:ascii="Calibri" w:eastAsia="Times New Roman" w:hAnsi="Calibri" w:cs="Calibri"/>
+                <w:color w:val="000000"/>
+                <w:lang w:val="en-NL"/>
+              </w:rPr>
+            </w:pPr>
+            <w:r>
+              <w:rPr>
+                <w:rFonts w:ascii="Calibri" w:eastAsia="Times New Roman" w:hAnsi="Calibri" w:cs="Calibri"/>
+                <w:color w:val="000000"/>
+                <w:lang w:val="en-NL"/>
+              </w:rPr>
+              <w:t>2</w:t>
+            </w:r>
+          </w:p>
+        </w:tc>
+        <w:tc>
+          <w:tcPr>
+            <w:tcW w:w="1005" w:type="dxa"/>
+            <w:tcBorders>
+              <w:top w:val="nil"/>
+              <w:left w:val="nil"/>
+              <w:bottom w:val="nil"/>
+              <w:right w:val="nil"/>
+            </w:tcBorders>
+            <w:noWrap/>
+            <w:vAlign w:val="bottom"/>
+            <w:hideMark/>
+          </w:tcPr>
+          <w:p>
+            <w:pPr>
+              <w:spacing w:line="240" w:lineRule="auto"/>
+              <w:jc w:val="center"/>
+              <w:rPr>
+                <w:rFonts w:ascii="Calibri" w:eastAsia="Times New Roman" w:hAnsi="Calibri" w:cs="Calibri"/>
+                <w:color w:val="000000"/>
+                <w:lang w:val="en-NL"/>
+              </w:rPr>
+            </w:pPr>
+            <w:r>
+              <w:rPr>
+                <w:rFonts w:ascii="Calibri" w:eastAsia="Times New Roman" w:hAnsi="Calibri" w:cs="Calibri"/>
+                <w:color w:val="000000"/>
+                <w:lang w:val="en-NL"/>
+              </w:rPr>
+              <w:t>TRUE</w:t>
+            </w:r>
+          </w:p>
+        </w:tc>
+        <w:tc>
+          <w:tcPr>
+            <w:tcW w:w="1320" w:type="dxa"/>
+            <w:tcBorders>
+              <w:top w:val="nil"/>
+              <w:left w:val="nil"/>
+              <w:bottom w:val="nil"/>
+              <w:right w:val="nil"/>
+            </w:tcBorders>
+            <w:noWrap/>
+            <w:vAlign w:val="bottom"/>
+            <w:hideMark/>
+          </w:tcPr>
+          <w:p>
+            <w:pPr>
+              <w:spacing w:line="240" w:lineRule="auto"/>
+              <w:jc w:val="right"/>
+              <w:rPr>
+                <w:rFonts w:ascii="Calibri" w:eastAsia="Times New Roman" w:hAnsi="Calibri" w:cs="Calibri"/>
+                <w:color w:val="000000"/>
+                <w:lang w:val="en-NL"/>
+              </w:rPr>
+            </w:pPr>
+            <w:r>
+              <w:rPr>
+                <w:rFonts w:ascii="Calibri" w:eastAsia="Times New Roman" w:hAnsi="Calibri" w:cs="Calibri"/>
+                <w:color w:val="000000"/>
+                <w:lang w:val="en-NL"/>
+              </w:rPr>
+              <w:t>9,8222</w:t>
+            </w:r>
+          </w:p>
+        </w:tc>
+        <w:tc>
+          <w:tcPr>
+            <w:tcW w:w="1180" w:type="dxa"/>
+            <w:tcBorders>
+              <w:top w:val="nil"/>
+              <w:left w:val="nil"/>
+              <w:bottom w:val="nil"/>
+              <w:right w:val="nil"/>
+            </w:tcBorders>
+            <w:noWrap/>
+            <w:vAlign w:val="bottom"/>
+            <w:hideMark/>
+          </w:tcPr>
+          <w:p>
+            <w:pPr>
+              <w:spacing w:line="240" w:lineRule="auto"/>
+              <w:jc w:val="right"/>
+              <w:rPr>
+                <w:rFonts w:ascii="Calibri" w:eastAsia="Times New Roman" w:hAnsi="Calibri" w:cs="Calibri"/>
+                <w:color w:val="000000"/>
+                <w:lang w:val="en-NL"/>
+              </w:rPr>
+            </w:pPr>
+            <w:r>
+              <w:rPr>
+                <w:rFonts w:ascii="Calibri" w:eastAsia="Times New Roman" w:hAnsi="Calibri" w:cs="Calibri"/>
+                <w:color w:val="000000"/>
+                <w:lang w:val="en-NL"/>
+              </w:rPr>
+              <w:t>3,5797</w:t>
+            </w:r>
+          </w:p>
+        </w:tc>
+      </w:tr>
+      <w:tr>
+        <w:trPr>
+          <w:trHeight w:val="300"/>
+        </w:trPr>
+        <w:tc>
+          <w:tcPr>
+            <w:tcW w:w="1220" w:type="dxa"/>
+            <w:tcBorders>
+              <w:top w:val="nil"/>
+              <w:left w:val="nil"/>
+              <w:bottom w:val="nil"/>
+              <w:right w:val="nil"/>
+            </w:tcBorders>
+            <w:noWrap/>
+            <w:vAlign w:val="bottom"/>
+            <w:hideMark/>
+          </w:tcPr>
+          <w:p>
+            <w:pPr>
+              <w:spacing w:line="240" w:lineRule="auto"/>
+              <w:jc w:val="right"/>
+              <w:rPr>
+                <w:rFonts w:ascii="Calibri" w:eastAsia="Times New Roman" w:hAnsi="Calibri" w:cs="Calibri"/>
+                <w:color w:val="000000"/>
+                <w:lang w:val="en-NL"/>
+              </w:rPr>
+            </w:pPr>
+            <w:r>
+              <w:rPr>
+                <w:rFonts w:ascii="Calibri" w:eastAsia="Times New Roman" w:hAnsi="Calibri" w:cs="Calibri"/>
+                <w:color w:val="000000"/>
+                <w:lang w:val="en-NL"/>
+              </w:rPr>
+              <w:t>3</w:t>
+            </w:r>
+          </w:p>
+        </w:tc>
+        <w:tc>
+          <w:tcPr>
+            <w:tcW w:w="1005" w:type="dxa"/>
+            <w:tcBorders>
+              <w:top w:val="nil"/>
+              <w:left w:val="nil"/>
+              <w:bottom w:val="nil"/>
+              <w:right w:val="nil"/>
+            </w:tcBorders>
+            <w:noWrap/>
+            <w:vAlign w:val="bottom"/>
+            <w:hideMark/>
+          </w:tcPr>
+          <w:p>
+            <w:pPr>
+              <w:spacing w:line="240" w:lineRule="auto"/>
+              <w:jc w:val="center"/>
+              <w:rPr>
+                <w:rFonts w:ascii="Calibri" w:eastAsia="Times New Roman" w:hAnsi="Calibri" w:cs="Calibri"/>
+                <w:color w:val="000000"/>
+                <w:lang w:val="en-NL"/>
+              </w:rPr>
+            </w:pPr>
+            <w:r>
+              <w:rPr>
+                <w:rFonts w:ascii="Calibri" w:eastAsia="Times New Roman" w:hAnsi="Calibri" w:cs="Calibri"/>
+                <w:color w:val="000000"/>
+                <w:lang w:val="en-NL"/>
+              </w:rPr>
+              <w:t>FALSE</w:t>
+            </w:r>
+          </w:p>
+        </w:tc>
+        <w:tc>
+          <w:tcPr>
+            <w:tcW w:w="1320" w:type="dxa"/>
+            <w:tcBorders>
+              <w:top w:val="nil"/>
+              <w:left w:val="nil"/>
+              <w:bottom w:val="nil"/>
+              <w:right w:val="nil"/>
+            </w:tcBorders>
+            <w:noWrap/>
+            <w:vAlign w:val="bottom"/>
+            <w:hideMark/>
+          </w:tcPr>
+          <w:p>
+            <w:pPr>
+              <w:spacing w:line="240" w:lineRule="auto"/>
+              <w:jc w:val="right"/>
+              <w:rPr>
+                <w:rFonts w:ascii="Calibri" w:eastAsia="Times New Roman" w:hAnsi="Calibri" w:cs="Calibri"/>
+                <w:color w:val="000000"/>
+                <w:lang w:val="en-NL"/>
+              </w:rPr>
+            </w:pPr>
+            <w:r>
+              <w:rPr>
+                <w:rFonts w:ascii="Calibri" w:eastAsia="Times New Roman" w:hAnsi="Calibri" w:cs="Calibri"/>
+                <w:color w:val="000000"/>
+                <w:lang w:val="en-NL"/>
+              </w:rPr>
+              <w:t>7,9052</w:t>
+            </w:r>
+          </w:p>
+        </w:tc>
+        <w:tc>
+          <w:tcPr>
+            <w:tcW w:w="1180" w:type="dxa"/>
+            <w:tcBorders>
+              <w:top w:val="nil"/>
+              <w:left w:val="nil"/>
+              <w:bottom w:val="nil"/>
+              <w:right w:val="nil"/>
+            </w:tcBorders>
+            <w:noWrap/>
+            <w:vAlign w:val="bottom"/>
+            <w:hideMark/>
+          </w:tcPr>
+          <w:p>
+            <w:pPr>
+              <w:spacing w:line="240" w:lineRule="auto"/>
+              <w:jc w:val="right"/>
+              <w:rPr>
+                <w:rFonts w:ascii="Calibri" w:eastAsia="Times New Roman" w:hAnsi="Calibri" w:cs="Calibri"/>
+                <w:color w:val="000000"/>
+                <w:lang w:val="en-NL"/>
+              </w:rPr>
+            </w:pPr>
+            <w:r>
+              <w:rPr>
+                <w:rFonts w:ascii="Calibri" w:eastAsia="Times New Roman" w:hAnsi="Calibri" w:cs="Calibri"/>
+                <w:color w:val="000000"/>
+                <w:lang w:val="en-NL"/>
+              </w:rPr>
+              <w:t>1,9781</w:t>
+            </w:r>
+          </w:p>
+        </w:tc>
+      </w:tr>
+      <w:tr>
+        <w:trPr>
+          <w:trHeight w:val="300"/>
+        </w:trPr>
+        <w:tc>
+          <w:tcPr>
+            <w:tcW w:w="1220" w:type="dxa"/>
+            <w:tcBorders>
+              <w:top w:val="nil"/>
+              <w:left w:val="nil"/>
+              <w:bottom w:val="nil"/>
+              <w:right w:val="nil"/>
+            </w:tcBorders>
+            <w:noWrap/>
+            <w:vAlign w:val="bottom"/>
+            <w:hideMark/>
+          </w:tcPr>
+          <w:p>
+            <w:pPr>
+              <w:spacing w:line="240" w:lineRule="auto"/>
+              <w:jc w:val="right"/>
+              <w:rPr>
+                <w:rFonts w:ascii="Calibri" w:eastAsia="Times New Roman" w:hAnsi="Calibri" w:cs="Calibri"/>
+                <w:color w:val="000000"/>
+                <w:lang w:val="en-NL"/>
+              </w:rPr>
+            </w:pPr>
+            <w:r>
+              <w:rPr>
+                <w:rFonts w:ascii="Calibri" w:eastAsia="Times New Roman" w:hAnsi="Calibri" w:cs="Calibri"/>
+                <w:color w:val="000000"/>
+                <w:lang w:val="en-NL"/>
+              </w:rPr>
+              <w:t>3</w:t>
+            </w:r>
+          </w:p>
+        </w:tc>
+        <w:tc>
+          <w:tcPr>
+            <w:tcW w:w="1005" w:type="dxa"/>
+            <w:tcBorders>
+              <w:top w:val="nil"/>
+              <w:left w:val="nil"/>
+              <w:bottom w:val="nil"/>
+              <w:right w:val="nil"/>
+            </w:tcBorders>
+            <w:noWrap/>
+            <w:vAlign w:val="bottom"/>
+            <w:hideMark/>
+          </w:tcPr>
+          <w:p>
+            <w:pPr>
+              <w:spacing w:line="240" w:lineRule="auto"/>
+              <w:jc w:val="center"/>
+              <w:rPr>
+                <w:rFonts w:ascii="Calibri" w:eastAsia="Times New Roman" w:hAnsi="Calibri" w:cs="Calibri"/>
+                <w:color w:val="000000"/>
+                <w:lang w:val="en-NL"/>
+              </w:rPr>
+            </w:pPr>
+            <w:r>
+              <w:rPr>
+                <w:rFonts w:ascii="Calibri" w:eastAsia="Times New Roman" w:hAnsi="Calibri" w:cs="Calibri"/>
+                <w:color w:val="000000"/>
+                <w:lang w:val="en-NL"/>
+              </w:rPr>
+              <w:t>TRUE</w:t>
+            </w:r>
+          </w:p>
+        </w:tc>
+        <w:tc>
+          <w:tcPr>
+            <w:tcW w:w="1320" w:type="dxa"/>
+            <w:tcBorders>
+              <w:top w:val="nil"/>
+              <w:left w:val="nil"/>
+              <w:bottom w:val="nil"/>
+              <w:right w:val="nil"/>
+            </w:tcBorders>
+            <w:noWrap/>
+            <w:vAlign w:val="bottom"/>
+            <w:hideMark/>
+          </w:tcPr>
+          <w:p>
+            <w:pPr>
+              <w:spacing w:line="240" w:lineRule="auto"/>
+              <w:jc w:val="right"/>
+              <w:rPr>
+                <w:rFonts w:ascii="Calibri" w:eastAsia="Times New Roman" w:hAnsi="Calibri" w:cs="Calibri"/>
+                <w:color w:val="000000"/>
+                <w:lang w:val="en-NL"/>
+              </w:rPr>
+            </w:pPr>
+            <w:r>
+              <w:rPr>
+                <w:rFonts w:ascii="Calibri" w:eastAsia="Times New Roman" w:hAnsi="Calibri" w:cs="Calibri"/>
+                <w:color w:val="000000"/>
+                <w:lang w:val="en-NL"/>
+              </w:rPr>
+              <w:t>7,9892</w:t>
+            </w:r>
+          </w:p>
+        </w:tc>
+        <w:tc>
+          <w:tcPr>
+            <w:tcW w:w="1180" w:type="dxa"/>
+            <w:tcBorders>
+              <w:top w:val="nil"/>
+              <w:left w:val="nil"/>
+              <w:bottom w:val="nil"/>
+              <w:right w:val="nil"/>
+            </w:tcBorders>
+            <w:noWrap/>
+            <w:vAlign w:val="bottom"/>
+            <w:hideMark/>
+          </w:tcPr>
+          <w:p>
+            <w:pPr>
+              <w:spacing w:line="240" w:lineRule="auto"/>
+              <w:jc w:val="right"/>
+              <w:rPr>
+                <w:rFonts w:ascii="Calibri" w:eastAsia="Times New Roman" w:hAnsi="Calibri" w:cs="Calibri"/>
+                <w:color w:val="000000"/>
+                <w:lang w:val="en-NL"/>
+              </w:rPr>
+            </w:pPr>
+            <w:r>
+              <w:rPr>
+                <w:rFonts w:ascii="Calibri" w:eastAsia="Times New Roman" w:hAnsi="Calibri" w:cs="Calibri"/>
+                <w:color w:val="000000"/>
+                <w:lang w:val="en-NL"/>
+              </w:rPr>
+              <w:t>2,0703</w:t>
+            </w:r>
+          </w:p>
+        </w:tc>
+      </w:tr>
+      <w:tr>
+        <w:trPr>
+          <w:trHeight w:val="300"/>
+        </w:trPr>
+        <w:tc>
+          <w:tcPr>
+            <w:tcW w:w="1220" w:type="dxa"/>
+            <w:tcBorders>
+              <w:top w:val="nil"/>
+              <w:left w:val="nil"/>
+              <w:bottom w:val="nil"/>
+              <w:right w:val="nil"/>
+            </w:tcBorders>
+            <w:noWrap/>
+            <w:vAlign w:val="bottom"/>
+            <w:hideMark/>
+          </w:tcPr>
+          <w:p>
+            <w:pPr>
+              <w:spacing w:line="240" w:lineRule="auto"/>
+              <w:jc w:val="right"/>
+              <w:rPr>
+                <w:rFonts w:ascii="Calibri" w:eastAsia="Times New Roman" w:hAnsi="Calibri" w:cs="Calibri"/>
+                <w:color w:val="000000"/>
+                <w:lang w:val="en-NL"/>
+              </w:rPr>
+            </w:pPr>
+            <w:r>
+              <w:rPr>
+                <w:rFonts w:ascii="Calibri" w:eastAsia="Times New Roman" w:hAnsi="Calibri" w:cs="Calibri"/>
+                <w:color w:val="000000"/>
+                <w:lang w:val="en-NL"/>
+              </w:rPr>
+              <w:t>4</w:t>
+            </w:r>
+          </w:p>
+        </w:tc>
+        <w:tc>
+          <w:tcPr>
+            <w:tcW w:w="1005" w:type="dxa"/>
+            <w:tcBorders>
+              <w:top w:val="nil"/>
+              <w:left w:val="nil"/>
+              <w:bottom w:val="nil"/>
+              <w:right w:val="nil"/>
+            </w:tcBorders>
+            <w:noWrap/>
+            <w:vAlign w:val="bottom"/>
+            <w:hideMark/>
+          </w:tcPr>
+          <w:p>
+            <w:pPr>
+              <w:spacing w:line="240" w:lineRule="auto"/>
+              <w:jc w:val="center"/>
+              <w:rPr>
+                <w:rFonts w:ascii="Calibri" w:eastAsia="Times New Roman" w:hAnsi="Calibri" w:cs="Calibri"/>
+                <w:color w:val="000000"/>
+                <w:lang w:val="en-NL"/>
+              </w:rPr>
+            </w:pPr>
+            <w:r>
+              <w:rPr>
+                <w:rFonts w:ascii="Calibri" w:eastAsia="Times New Roman" w:hAnsi="Calibri" w:cs="Calibri"/>
+                <w:color w:val="000000"/>
+                <w:lang w:val="en-NL"/>
+              </w:rPr>
+              <w:t>FALSE</w:t>
+            </w:r>
+          </w:p>
+        </w:tc>
+        <w:tc>
+          <w:tcPr>
+            <w:tcW w:w="1320" w:type="dxa"/>
+            <w:tcBorders>
+              <w:top w:val="nil"/>
+              <w:left w:val="nil"/>
+              <w:bottom w:val="nil"/>
+              <w:right w:val="nil"/>
+            </w:tcBorders>
+            <w:noWrap/>
+            <w:vAlign w:val="bottom"/>
+            <w:hideMark/>
+          </w:tcPr>
+          <w:p>
+            <w:pPr>
+              <w:spacing w:line="240" w:lineRule="auto"/>
+              <w:jc w:val="right"/>
+              <w:rPr>
+                <w:rFonts w:ascii="Calibri" w:eastAsia="Times New Roman" w:hAnsi="Calibri" w:cs="Calibri"/>
+                <w:color w:val="000000"/>
+                <w:lang w:val="en-NL"/>
+              </w:rPr>
+            </w:pPr>
+            <w:r>
+              <w:rPr>
+                <w:rFonts w:ascii="Calibri" w:eastAsia="Times New Roman" w:hAnsi="Calibri" w:cs="Calibri"/>
+                <w:color w:val="000000"/>
+                <w:lang w:val="en-NL"/>
+              </w:rPr>
+              <w:t>7,6434</w:t>
+            </w:r>
+          </w:p>
+        </w:tc>
+        <w:tc>
+          <w:tcPr>
+            <w:tcW w:w="1180" w:type="dxa"/>
+            <w:tcBorders>
+              <w:top w:val="nil"/>
+              <w:left w:val="nil"/>
+              <w:bottom w:val="nil"/>
+              <w:right w:val="nil"/>
+            </w:tcBorders>
+            <w:noWrap/>
+            <w:vAlign w:val="bottom"/>
+            <w:hideMark/>
+          </w:tcPr>
+          <w:p>
+            <w:pPr>
+              <w:spacing w:line="240" w:lineRule="auto"/>
+              <w:jc w:val="right"/>
+              <w:rPr>
+                <w:rFonts w:ascii="Calibri" w:eastAsia="Times New Roman" w:hAnsi="Calibri" w:cs="Calibri"/>
+                <w:color w:val="000000"/>
+                <w:lang w:val="en-NL"/>
+              </w:rPr>
+            </w:pPr>
+            <w:r>
+              <w:rPr>
+                <w:rFonts w:ascii="Calibri" w:eastAsia="Times New Roman" w:hAnsi="Calibri" w:cs="Calibri"/>
+                <w:color w:val="000000"/>
+                <w:lang w:val="en-NL"/>
+              </w:rPr>
+              <w:t>1,5708</w:t>
+            </w:r>
+          </w:p>
+        </w:tc>
+      </w:tr>
+      <w:tr>
+        <w:trPr>
+          <w:trHeight w:val="300"/>
+        </w:trPr>
+        <w:tc>
+          <w:tcPr>
+            <w:tcW w:w="1220" w:type="dxa"/>
+            <w:tcBorders>
+              <w:top w:val="nil"/>
+              <w:left w:val="nil"/>
+              <w:bottom w:val="nil"/>
+              <w:right w:val="nil"/>
+            </w:tcBorders>
+            <w:noWrap/>
+            <w:vAlign w:val="bottom"/>
+            <w:hideMark/>
+          </w:tcPr>
+          <w:p>
+            <w:pPr>
+              <w:spacing w:line="240" w:lineRule="auto"/>
+              <w:jc w:val="right"/>
+              <w:rPr>
+                <w:rFonts w:ascii="Calibri" w:eastAsia="Times New Roman" w:hAnsi="Calibri" w:cs="Calibri"/>
+                <w:color w:val="000000"/>
+                <w:lang w:val="en-NL"/>
+              </w:rPr>
+            </w:pPr>
+            <w:r>
+              <w:rPr>
+                <w:rFonts w:ascii="Calibri" w:eastAsia="Times New Roman" w:hAnsi="Calibri" w:cs="Calibri"/>
+                <w:color w:val="000000"/>
+                <w:lang w:val="en-NL"/>
+              </w:rPr>
+              <w:t>4</w:t>
+            </w:r>
+          </w:p>
+        </w:tc>
+        <w:tc>
+          <w:tcPr>
+            <w:tcW w:w="1005" w:type="dxa"/>
+            <w:tcBorders>
+              <w:top w:val="nil"/>
+              <w:left w:val="nil"/>
+              <w:bottom w:val="nil"/>
+              <w:right w:val="nil"/>
+            </w:tcBorders>
+            <w:noWrap/>
+            <w:vAlign w:val="bottom"/>
+            <w:hideMark/>
+          </w:tcPr>
+          <w:p>
+            <w:pPr>
+              <w:spacing w:line="240" w:lineRule="auto"/>
+              <w:jc w:val="center"/>
+              <w:rPr>
+                <w:rFonts w:ascii="Calibri" w:eastAsia="Times New Roman" w:hAnsi="Calibri" w:cs="Calibri"/>
+                <w:color w:val="000000"/>
+                <w:lang w:val="en-NL"/>
+              </w:rPr>
+            </w:pPr>
+            <w:r>
+              <w:rPr>
+                <w:rFonts w:ascii="Calibri" w:eastAsia="Times New Roman" w:hAnsi="Calibri" w:cs="Calibri"/>
+                <w:color w:val="000000"/>
+                <w:lang w:val="en-NL"/>
+              </w:rPr>
+              <w:t>TRUE</w:t>
+            </w:r>
+          </w:p>
+        </w:tc>
+        <w:tc>
+          <w:tcPr>
+            <w:tcW w:w="1320" w:type="dxa"/>
+            <w:tcBorders>
+              <w:top w:val="nil"/>
+              <w:left w:val="nil"/>
+              <w:bottom w:val="nil"/>
+              <w:right w:val="nil"/>
+            </w:tcBorders>
+            <w:noWrap/>
+            <w:vAlign w:val="bottom"/>
+            <w:hideMark/>
+          </w:tcPr>
+          <w:p>
+            <w:pPr>
+              <w:spacing w:line="240" w:lineRule="auto"/>
+              <w:jc w:val="right"/>
+              <w:rPr>
+                <w:rFonts w:ascii="Calibri" w:eastAsia="Times New Roman" w:hAnsi="Calibri" w:cs="Calibri"/>
+                <w:color w:val="000000"/>
+                <w:lang w:val="en-NL"/>
+              </w:rPr>
+            </w:pPr>
+            <w:r>
+              <w:rPr>
+                <w:rFonts w:ascii="Calibri" w:eastAsia="Times New Roman" w:hAnsi="Calibri" w:cs="Calibri"/>
+                <w:color w:val="000000"/>
+                <w:lang w:val="en-NL"/>
+              </w:rPr>
+              <w:t>7,4251</w:t>
+            </w:r>
+          </w:p>
+        </w:tc>
+        <w:tc>
+          <w:tcPr>
+            <w:tcW w:w="1180" w:type="dxa"/>
+            <w:tcBorders>
+              <w:top w:val="nil"/>
+              <w:left w:val="nil"/>
+              <w:bottom w:val="nil"/>
+              <w:right w:val="nil"/>
+            </w:tcBorders>
+            <w:noWrap/>
+            <w:vAlign w:val="bottom"/>
+            <w:hideMark/>
+          </w:tcPr>
+          <w:p>
+            <w:pPr>
+              <w:spacing w:line="240" w:lineRule="auto"/>
+              <w:jc w:val="right"/>
+              <w:rPr>
+                <w:rFonts w:ascii="Calibri" w:eastAsia="Times New Roman" w:hAnsi="Calibri" w:cs="Calibri"/>
+                <w:color w:val="000000"/>
+                <w:lang w:val="en-NL"/>
+              </w:rPr>
+            </w:pPr>
+            <w:r>
+              <w:rPr>
+                <w:rFonts w:ascii="Calibri" w:eastAsia="Times New Roman" w:hAnsi="Calibri" w:cs="Calibri"/>
+                <w:color w:val="000000"/>
+                <w:lang w:val="en-NL"/>
+              </w:rPr>
+              <w:t>1,5988</w:t>
+            </w:r>
+          </w:p>
+        </w:tc>
+      </w:tr>
+      <w:tr>
+        <w:trPr>
+          <w:trHeight w:val="300"/>
+        </w:trPr>
+        <w:tc>
+          <w:tcPr>
+            <w:tcW w:w="1220" w:type="dxa"/>
+            <w:tcBorders>
+              <w:top w:val="nil"/>
+              <w:left w:val="nil"/>
+              <w:bottom w:val="nil"/>
+              <w:right w:val="nil"/>
+            </w:tcBorders>
+            <w:noWrap/>
+            <w:vAlign w:val="bottom"/>
+            <w:hideMark/>
+          </w:tcPr>
+          <w:p>
+            <w:pPr>
+              <w:spacing w:line="240" w:lineRule="auto"/>
+              <w:jc w:val="right"/>
+              <w:rPr>
+                <w:rFonts w:ascii="Calibri" w:eastAsia="Times New Roman" w:hAnsi="Calibri" w:cs="Calibri"/>
+                <w:color w:val="000000"/>
+                <w:lang w:val="en-NL"/>
+              </w:rPr>
+            </w:pPr>
+            <w:r>
+              <w:rPr>
+                <w:rFonts w:ascii="Calibri" w:eastAsia="Times New Roman" w:hAnsi="Calibri" w:cs="Calibri"/>
+                <w:color w:val="000000"/>
+                <w:lang w:val="en-NL"/>
+              </w:rPr>
+              <w:t>5</w:t>
+            </w:r>
+          </w:p>
+        </w:tc>
+        <w:tc>
+          <w:tcPr>
+            <w:tcW w:w="1005" w:type="dxa"/>
+            <w:tcBorders>
+              <w:top w:val="nil"/>
+              <w:left w:val="nil"/>
+              <w:bottom w:val="nil"/>
+              <w:right w:val="nil"/>
+            </w:tcBorders>
+            <w:noWrap/>
+            <w:vAlign w:val="bottom"/>
+            <w:hideMark/>
+          </w:tcPr>
+          <w:p>
+            <w:pPr>
+              <w:spacing w:line="240" w:lineRule="auto"/>
+              <w:jc w:val="center"/>
+              <w:rPr>
+                <w:rFonts w:ascii="Calibri" w:eastAsia="Times New Roman" w:hAnsi="Calibri" w:cs="Calibri"/>
+                <w:color w:val="000000"/>
+                <w:lang w:val="en-NL"/>
+              </w:rPr>
+            </w:pPr>
+            <w:r>
+              <w:rPr>
+                <w:rFonts w:ascii="Calibri" w:eastAsia="Times New Roman" w:hAnsi="Calibri" w:cs="Calibri"/>
+                <w:color w:val="000000"/>
+                <w:lang w:val="en-NL"/>
+              </w:rPr>
+              <w:t>FALSE</w:t>
+            </w:r>
+          </w:p>
+        </w:tc>
+        <w:tc>
+          <w:tcPr>
+            <w:tcW w:w="1320" w:type="dxa"/>
+            <w:tcBorders>
+              <w:top w:val="nil"/>
+              <w:left w:val="nil"/>
+              <w:bottom w:val="nil"/>
+              <w:right w:val="nil"/>
+            </w:tcBorders>
+            <w:noWrap/>
+            <w:vAlign w:val="bottom"/>
+            <w:hideMark/>
+          </w:tcPr>
+          <w:p>
+            <w:pPr>
+              <w:spacing w:line="240" w:lineRule="auto"/>
+              <w:jc w:val="right"/>
+              <w:rPr>
+                <w:rFonts w:ascii="Calibri" w:eastAsia="Times New Roman" w:hAnsi="Calibri" w:cs="Calibri"/>
+                <w:color w:val="000000"/>
+                <w:lang w:val="en-NL"/>
+              </w:rPr>
+            </w:pPr>
+            <w:r>
+              <w:rPr>
+                <w:rFonts w:ascii="Calibri" w:eastAsia="Times New Roman" w:hAnsi="Calibri" w:cs="Calibri"/>
+                <w:color w:val="000000"/>
+                <w:lang w:val="en-NL"/>
+              </w:rPr>
+              <w:t>6,3376</w:t>
+            </w:r>
+          </w:p>
+        </w:tc>
+        <w:tc>
+          <w:tcPr>
+            <w:tcW w:w="1180" w:type="dxa"/>
+            <w:tcBorders>
+              <w:top w:val="nil"/>
+              <w:left w:val="nil"/>
+              <w:bottom w:val="nil"/>
+              <w:right w:val="nil"/>
+            </w:tcBorders>
+            <w:noWrap/>
+            <w:vAlign w:val="bottom"/>
+            <w:hideMark/>
+          </w:tcPr>
+          <w:p>
+            <w:pPr>
+              <w:spacing w:line="240" w:lineRule="auto"/>
+              <w:jc w:val="right"/>
+              <w:rPr>
+                <w:rFonts w:ascii="Calibri" w:eastAsia="Times New Roman" w:hAnsi="Calibri" w:cs="Calibri"/>
+                <w:color w:val="000000"/>
+                <w:lang w:val="en-NL"/>
+              </w:rPr>
+            </w:pPr>
+            <w:r>
+              <w:rPr>
+                <w:rFonts w:ascii="Calibri" w:eastAsia="Times New Roman" w:hAnsi="Calibri" w:cs="Calibri"/>
+                <w:color w:val="000000"/>
+                <w:lang w:val="en-NL"/>
+              </w:rPr>
+              <w:t>1,1241</w:t>
+            </w:r>
+          </w:p>
+        </w:tc>
+      </w:tr>
+      <w:tr>
+        <w:trPr>
+          <w:trHeight w:val="300"/>
+        </w:trPr>
+        <w:tc>
+          <w:tcPr>
+            <w:tcW w:w="1220" w:type="dxa"/>
+            <w:tcBorders>
+              <w:top w:val="nil"/>
+              <w:left w:val="nil"/>
+              <w:bottom w:val="nil"/>
+              <w:right w:val="nil"/>
+            </w:tcBorders>
+            <w:noWrap/>
+            <w:vAlign w:val="bottom"/>
+            <w:hideMark/>
+          </w:tcPr>
+          <w:p>
+            <w:pPr>
+              <w:spacing w:line="240" w:lineRule="auto"/>
+              <w:jc w:val="right"/>
+              <w:rPr>
+                <w:rFonts w:ascii="Calibri" w:eastAsia="Times New Roman" w:hAnsi="Calibri" w:cs="Calibri"/>
+                <w:color w:val="000000"/>
+                <w:lang w:val="en-NL"/>
+              </w:rPr>
+            </w:pPr>
+            <w:r>
+              <w:rPr>
+                <w:rFonts w:ascii="Calibri" w:eastAsia="Times New Roman" w:hAnsi="Calibri" w:cs="Calibri"/>
+                <w:color w:val="000000"/>
+                <w:lang w:val="en-NL"/>
+              </w:rPr>
+              <w:t>5</w:t>
+            </w:r>
+          </w:p>
+        </w:tc>
+        <w:tc>
+          <w:tcPr>
+            <w:tcW w:w="1005" w:type="dxa"/>
+            <w:tcBorders>
+              <w:top w:val="nil"/>
+              <w:left w:val="nil"/>
+              <w:bottom w:val="nil"/>
+              <w:right w:val="nil"/>
+            </w:tcBorders>
+            <w:noWrap/>
+            <w:vAlign w:val="bottom"/>
+            <w:hideMark/>
+          </w:tcPr>
+          <w:p>
+            <w:pPr>
+              <w:spacing w:line="240" w:lineRule="auto"/>
+              <w:jc w:val="center"/>
+              <w:rPr>
+                <w:rFonts w:ascii="Calibri" w:eastAsia="Times New Roman" w:hAnsi="Calibri" w:cs="Calibri"/>
+                <w:color w:val="000000"/>
+                <w:lang w:val="en-NL"/>
+              </w:rPr>
+            </w:pPr>
+            <w:r>
+              <w:rPr>
+                <w:rFonts w:ascii="Calibri" w:eastAsia="Times New Roman" w:hAnsi="Calibri" w:cs="Calibri"/>
+                <w:color w:val="000000"/>
+                <w:lang w:val="en-NL"/>
+              </w:rPr>
+              <w:t>TRUE</w:t>
+            </w:r>
+          </w:p>
+        </w:tc>
+        <w:tc>
+          <w:tcPr>
+            <w:tcW w:w="1320" w:type="dxa"/>
+            <w:tcBorders>
+              <w:top w:val="nil"/>
+              <w:left w:val="nil"/>
+              <w:bottom w:val="nil"/>
+              <w:right w:val="nil"/>
+            </w:tcBorders>
+            <w:noWrap/>
+            <w:vAlign w:val="bottom"/>
+            <w:hideMark/>
+          </w:tcPr>
+          <w:p>
+            <w:pPr>
+              <w:spacing w:line="240" w:lineRule="auto"/>
+              <w:jc w:val="right"/>
+              <w:rPr>
+                <w:rFonts w:ascii="Calibri" w:eastAsia="Times New Roman" w:hAnsi="Calibri" w:cs="Calibri"/>
+                <w:color w:val="000000"/>
+                <w:lang w:val="en-NL"/>
+              </w:rPr>
+            </w:pPr>
+            <w:r>
+              <w:rPr>
+                <w:rFonts w:ascii="Calibri" w:eastAsia="Times New Roman" w:hAnsi="Calibri" w:cs="Calibri"/>
+                <w:color w:val="000000"/>
+                <w:lang w:val="en-NL"/>
+              </w:rPr>
+              <w:t>6,3695</w:t>
+            </w:r>
+          </w:p>
+        </w:tc>
+        <w:tc>
+          <w:tcPr>
+            <w:tcW w:w="1180" w:type="dxa"/>
+            <w:tcBorders>
+              <w:top w:val="nil"/>
+              <w:left w:val="nil"/>
+              <w:bottom w:val="nil"/>
+              <w:right w:val="nil"/>
+            </w:tcBorders>
+            <w:noWrap/>
+            <w:vAlign w:val="bottom"/>
+            <w:hideMark/>
+          </w:tcPr>
+          <w:p>
+            <w:pPr>
+              <w:spacing w:line="240" w:lineRule="auto"/>
+              <w:jc w:val="right"/>
+              <w:rPr>
+                <w:rFonts w:ascii="Calibri" w:eastAsia="Times New Roman" w:hAnsi="Calibri" w:cs="Calibri"/>
+                <w:color w:val="000000"/>
+                <w:lang w:val="en-NL"/>
+              </w:rPr>
+            </w:pPr>
+            <w:r>
+              <w:rPr>
+                <w:rFonts w:ascii="Calibri" w:eastAsia="Times New Roman" w:hAnsi="Calibri" w:cs="Calibri"/>
+                <w:color w:val="000000"/>
+                <w:lang w:val="en-NL"/>
+              </w:rPr>
+              <w:t>1,2119</w:t>
+            </w:r>
+          </w:p>
+        </w:tc>
+      </w:tr>
+      <w:tr>
+        <w:trPr>
+          <w:trHeight w:val="300"/>
+        </w:trPr>
+        <w:tc>
+          <w:tcPr>
+            <w:tcW w:w="1220" w:type="dxa"/>
+            <w:tcBorders>
+              <w:top w:val="nil"/>
+              <w:left w:val="nil"/>
+              <w:bottom w:val="nil"/>
+              <w:right w:val="nil"/>
+            </w:tcBorders>
+            <w:noWrap/>
+            <w:vAlign w:val="bottom"/>
+            <w:hideMark/>
+          </w:tcPr>
+          <w:p>
+            <w:pPr>
+              <w:spacing w:line="240" w:lineRule="auto"/>
+              <w:jc w:val="right"/>
+              <w:rPr>
+                <w:rFonts w:ascii="Calibri" w:eastAsia="Times New Roman" w:hAnsi="Calibri" w:cs="Calibri"/>
+                <w:color w:val="000000"/>
+                <w:lang w:val="en-NL"/>
+              </w:rPr>
+            </w:pPr>
+            <w:r>
+              <w:rPr>
+                <w:rFonts w:ascii="Calibri" w:eastAsia="Times New Roman" w:hAnsi="Calibri" w:cs="Calibri"/>
+                <w:color w:val="000000"/>
+                <w:lang w:val="en-NL"/>
+              </w:rPr>
+              <w:t>6</w:t>
+            </w:r>
+          </w:p>
+        </w:tc>
+        <w:tc>
+          <w:tcPr>
+            <w:tcW w:w="1005" w:type="dxa"/>
+            <w:tcBorders>
+              <w:top w:val="nil"/>
+              <w:left w:val="nil"/>
+              <w:bottom w:val="nil"/>
+              <w:right w:val="nil"/>
+            </w:tcBorders>
+            <w:noWrap/>
+            <w:vAlign w:val="bottom"/>
+            <w:hideMark/>
+          </w:tcPr>
+          <w:p>
+            <w:pPr>
+              <w:spacing w:line="240" w:lineRule="auto"/>
+              <w:jc w:val="center"/>
+              <w:rPr>
+                <w:rFonts w:ascii="Calibri" w:eastAsia="Times New Roman" w:hAnsi="Calibri" w:cs="Calibri"/>
+                <w:color w:val="000000"/>
+                <w:lang w:val="en-NL"/>
+              </w:rPr>
+            </w:pPr>
+            <w:r>
+              <w:rPr>
+                <w:rFonts w:ascii="Calibri" w:eastAsia="Times New Roman" w:hAnsi="Calibri" w:cs="Calibri"/>
+                <w:color w:val="000000"/>
+                <w:lang w:val="en-NL"/>
+              </w:rPr>
+              <w:t>FALSE</w:t>
+            </w:r>
+          </w:p>
+        </w:tc>
+        <w:tc>
+          <w:tcPr>
+            <w:tcW w:w="1320" w:type="dxa"/>
+            <w:tcBorders>
+              <w:top w:val="nil"/>
+              <w:left w:val="nil"/>
+              <w:bottom w:val="nil"/>
+              <w:right w:val="nil"/>
+            </w:tcBorders>
+            <w:noWrap/>
+            <w:vAlign w:val="bottom"/>
+            <w:hideMark/>
+          </w:tcPr>
+          <w:p>
+            <w:pPr>
+              <w:spacing w:line="240" w:lineRule="auto"/>
+              <w:jc w:val="right"/>
+              <w:rPr>
+                <w:rFonts w:ascii="Calibri" w:eastAsia="Times New Roman" w:hAnsi="Calibri" w:cs="Calibri"/>
+                <w:color w:val="000000"/>
+                <w:lang w:val="en-NL"/>
+              </w:rPr>
+            </w:pPr>
+            <w:r>
+              <w:rPr>
+                <w:rFonts w:ascii="Calibri" w:eastAsia="Times New Roman" w:hAnsi="Calibri" w:cs="Calibri"/>
+                <w:color w:val="000000"/>
+                <w:lang w:val="en-NL"/>
+              </w:rPr>
+              <w:t>5,7771</w:t>
+            </w:r>
+          </w:p>
+        </w:tc>
+        <w:tc>
+          <w:tcPr>
+            <w:tcW w:w="1180" w:type="dxa"/>
+            <w:tcBorders>
+              <w:top w:val="nil"/>
+              <w:left w:val="nil"/>
+              <w:bottom w:val="nil"/>
+              <w:right w:val="nil"/>
+            </w:tcBorders>
+            <w:noWrap/>
+            <w:vAlign w:val="bottom"/>
+            <w:hideMark/>
+          </w:tcPr>
+          <w:p>
+            <w:pPr>
+              <w:spacing w:line="240" w:lineRule="auto"/>
+              <w:jc w:val="right"/>
+              <w:rPr>
+                <w:rFonts w:ascii="Calibri" w:eastAsia="Times New Roman" w:hAnsi="Calibri" w:cs="Calibri"/>
+                <w:color w:val="000000"/>
+                <w:lang w:val="en-NL"/>
+              </w:rPr>
+            </w:pPr>
+            <w:r>
+              <w:rPr>
+                <w:rFonts w:ascii="Calibri" w:eastAsia="Times New Roman" w:hAnsi="Calibri" w:cs="Calibri"/>
+                <w:color w:val="000000"/>
+                <w:lang w:val="en-NL"/>
+              </w:rPr>
+              <w:t>0,9905</w:t>
+            </w:r>
+          </w:p>
+        </w:tc>
+      </w:tr>
+      <w:tr>
+        <w:trPr>
+          <w:trHeight w:val="300"/>
+        </w:trPr>
+        <w:tc>
+          <w:tcPr>
+            <w:tcW w:w="1220" w:type="dxa"/>
+            <w:tcBorders>
+              <w:top w:val="nil"/>
+              <w:left w:val="nil"/>
+              <w:bottom w:val="nil"/>
+              <w:right w:val="nil"/>
+            </w:tcBorders>
+            <w:noWrap/>
+            <w:vAlign w:val="bottom"/>
+            <w:hideMark/>
+          </w:tcPr>
+          <w:p>
+            <w:pPr>
+              <w:spacing w:line="240" w:lineRule="auto"/>
+              <w:jc w:val="right"/>
+              <w:rPr>
+                <w:rFonts w:ascii="Calibri" w:eastAsia="Times New Roman" w:hAnsi="Calibri" w:cs="Calibri"/>
+                <w:color w:val="000000"/>
+                <w:lang w:val="en-NL"/>
+              </w:rPr>
+            </w:pPr>
+            <w:r>
+              <w:rPr>
+                <w:rFonts w:ascii="Calibri" w:eastAsia="Times New Roman" w:hAnsi="Calibri" w:cs="Calibri"/>
+                <w:color w:val="000000"/>
+                <w:lang w:val="en-NL"/>
+              </w:rPr>
+              <w:t>6</w:t>
+            </w:r>
+          </w:p>
+        </w:tc>
+        <w:tc>
+          <w:tcPr>
+            <w:tcW w:w="1005" w:type="dxa"/>
+            <w:tcBorders>
+              <w:top w:val="nil"/>
+              <w:left w:val="nil"/>
+              <w:bottom w:val="nil"/>
+              <w:right w:val="nil"/>
+            </w:tcBorders>
+            <w:noWrap/>
+            <w:vAlign w:val="bottom"/>
+            <w:hideMark/>
+          </w:tcPr>
+          <w:p>
+            <w:pPr>
+              <w:spacing w:line="240" w:lineRule="auto"/>
+              <w:jc w:val="center"/>
+              <w:rPr>
+                <w:rFonts w:ascii="Calibri" w:eastAsia="Times New Roman" w:hAnsi="Calibri" w:cs="Calibri"/>
+                <w:color w:val="000000"/>
+                <w:lang w:val="en-NL"/>
+              </w:rPr>
+            </w:pPr>
+            <w:r>
+              <w:rPr>
+                <w:rFonts w:ascii="Calibri" w:eastAsia="Times New Roman" w:hAnsi="Calibri" w:cs="Calibri"/>
+                <w:color w:val="000000"/>
+                <w:lang w:val="en-NL"/>
+              </w:rPr>
+              <w:t>TRUE</w:t>
+            </w:r>
+          </w:p>
+        </w:tc>
+        <w:tc>
+          <w:tcPr>
+            <w:tcW w:w="1320" w:type="dxa"/>
+            <w:tcBorders>
+              <w:top w:val="nil"/>
+              <w:left w:val="nil"/>
+              <w:bottom w:val="nil"/>
+              <w:right w:val="nil"/>
+            </w:tcBorders>
+            <w:noWrap/>
+            <w:vAlign w:val="bottom"/>
+            <w:hideMark/>
+          </w:tcPr>
+          <w:p>
+            <w:pPr>
+              <w:spacing w:line="240" w:lineRule="auto"/>
+              <w:jc w:val="right"/>
+              <w:rPr>
+                <w:rFonts w:ascii="Calibri" w:eastAsia="Times New Roman" w:hAnsi="Calibri" w:cs="Calibri"/>
+                <w:color w:val="000000"/>
+                <w:lang w:val="en-NL"/>
+              </w:rPr>
+            </w:pPr>
+            <w:r>
+              <w:rPr>
+                <w:rFonts w:ascii="Calibri" w:eastAsia="Times New Roman" w:hAnsi="Calibri" w:cs="Calibri"/>
+                <w:color w:val="000000"/>
+                <w:lang w:val="en-NL"/>
+              </w:rPr>
+              <w:t>6,0856</w:t>
+            </w:r>
+          </w:p>
+        </w:tc>
+        <w:tc>
+          <w:tcPr>
+            <w:tcW w:w="1180" w:type="dxa"/>
+            <w:tcBorders>
+              <w:top w:val="nil"/>
+              <w:left w:val="nil"/>
+              <w:bottom w:val="nil"/>
+              <w:right w:val="nil"/>
+            </w:tcBorders>
+            <w:noWrap/>
+            <w:vAlign w:val="bottom"/>
+            <w:hideMark/>
+          </w:tcPr>
+          <w:p>
+            <w:pPr>
+              <w:spacing w:line="240" w:lineRule="auto"/>
+              <w:jc w:val="right"/>
+              <w:rPr>
+                <w:rFonts w:ascii="Calibri" w:eastAsia="Times New Roman" w:hAnsi="Calibri" w:cs="Calibri"/>
+                <w:color w:val="000000"/>
+                <w:lang w:val="en-NL"/>
+              </w:rPr>
+            </w:pPr>
+            <w:r>
+              <w:rPr>
+                <w:rFonts w:ascii="Calibri" w:eastAsia="Times New Roman" w:hAnsi="Calibri" w:cs="Calibri"/>
+                <w:color w:val="000000"/>
+                <w:lang w:val="en-NL"/>
+              </w:rPr>
+              <w:t>0,9935</w:t>
+            </w:r>
+          </w:p>
+        </w:tc>
+      </w:tr>
+    </w:tbl>
+    <w:p>
+      <w:pPr>
+        <w:rPr>
+          <w:sz w:val="20"/>
+          <w:szCs w:val="20"/>
+        </w:rPr>
+      </w:pPr>
+    </w:p>
+    <w:p>
+      <w:pPr>
+        <w:rPr>
+          <w:sz w:val="20"/>
+          <w:szCs w:val="20"/>
+        </w:rPr>
+      </w:pPr>
+      <w:r>
+        <w:rPr>
+          <w:sz w:val="20"/>
+          <w:szCs w:val="20"/>
+        </w:rPr>
+        <w:t>Zoals te zien heeft het opdelen in processen met MPI een goed effect maar lijkt OpenMP nog niet veel te doen, mijn vermoeden is dat dit komt doordat elke pixel een losse thread heeft waardoor de overhead te groot wordt. In plaats daarvan ga ik OpenMP nu per frame toepassen i.p.v. pixel.</w:t>
+      </w:r>
+    </w:p>
+    <w:p>
+      <w:pPr>
+        <w:rPr>
+          <w:sz w:val="20"/>
+          <w:szCs w:val="20"/>
+        </w:rPr>
+      </w:pPr>
+      <w:r>
+        <w:rPr>
+          <w:sz w:val="20"/>
+          <w:szCs w:val="20"/>
+        </w:rPr>
+        <w:t xml:space="preserve">Na dit te doen bleek het resultaat nog slechter, dit heb ik opgeslagen in frame.xlsx </w:t>
+      </w:r>
+    </w:p>
+    <w:p>
+      <w:pPr>
+        <w:rPr>
+          <w:sz w:val="20"/>
+          <w:szCs w:val="20"/>
+        </w:rPr>
+      </w:pPr>
+      <w:r>
+        <w:rPr>
+          <w:sz w:val="20"/>
+          <w:szCs w:val="20"/>
+        </w:rPr>
+        <w:t xml:space="preserve">Bij 4 frames was het resultaat in het begin ook nog langzamer tot 3 frames waar het een tiende hielp. </w:t>
+      </w:r>
+    </w:p>
+    <w:p>
+      <w:pPr>
+        <w:rPr>
+          <w:sz w:val="20"/>
+          <w:szCs w:val="20"/>
+        </w:rPr>
+      </w:pPr>
+      <w:r>
+        <w:rPr>
+          <w:sz w:val="20"/>
+          <w:szCs w:val="20"/>
+        </w:rPr>
+        <w:t>Om mijn excel bestand en de toekomstige plots informatief te houden voeg ik dit niet toe maar zorgt er wel voor dat verder kijk naar grotere chunks voor OpenMP</w:t>
+      </w:r>
+    </w:p>
+    <w:p>
+      <w:pPr>
+        <w:rPr>
+          <w:sz w:val="20"/>
+          <w:szCs w:val="20"/>
+        </w:rPr>
+      </w:pPr>
+      <w:r>
+        <w:rPr>
+          <w:sz w:val="20"/>
+          <w:szCs w:val="20"/>
+        </w:rPr>
+        <w:t>Achteraf gezien kon dus mijn OpenMP implementatie ook nog een stuk beter.</w:t>
+      </w:r>
     </w:p>
     <w:p>
       <w:pPr>
@@ -4365,9 +6255,8 @@
       </w:pPr>
     </w:p>
     <w:sectPr>
-      <w:pgSz w:w="11909" w:h="16834"/>
+      <w:pgSz w:w="12240" w:h="15840"/>
       <w:pgMar w:top="1440" w:right="1440" w:bottom="1440" w:left="1440" w:header="720" w:footer="720" w:gutter="0"/>
-      <w:pgNumType w:start="1"/>
       <w:cols w:space="720"/>
     </w:sectPr>
   </w:body>

</xml_diff>